<commit_message>
pattern recogniztion table addition
</commit_message>
<xml_diff>
--- a/DSA_Pattern -  Cheet_heet.docx
+++ b/DSA_Pattern -  Cheet_heet.docx
@@ -20401,6 +20401,1183 @@
         <w:t xml:space="preserve"> not</w:t>
       </w:r>
     </w:p>
+    <w:p/>
+    <w:tbl>
+      <w:tblPr>
+        <w:tblW w:w="0" w:type="auto"/>
+        <w:tblCellSpacing w:w="15" w:type="dxa"/>
+        <w:tblCellMar>
+          <w:left w:w="0" w:type="dxa"/>
+          <w:right w:w="0" w:type="dxa"/>
+        </w:tblCellMar>
+        <w:tblLook w:val="04A0" w:firstRow="1" w:lastRow="0" w:firstColumn="1" w:lastColumn="0" w:noHBand="0" w:noVBand="1"/>
+      </w:tblPr>
+      <w:tblGrid>
+        <w:gridCol w:w="4485"/>
+        <w:gridCol w:w="2193"/>
+        <w:gridCol w:w="2332"/>
+      </w:tblGrid>
+      <w:tr>
+        <w:trPr>
+          <w:tblHeader/>
+          <w:tblCellSpacing w:w="15" w:type="dxa"/>
+        </w:trPr>
+        <w:tc>
+          <w:tcPr>
+            <w:tcW w:w="0" w:type="auto"/>
+            <w:tcBorders>
+              <w:top w:val="single" w:sz="6" w:space="0" w:color="auto"/>
+              <w:left w:val="single" w:sz="6" w:space="0" w:color="auto"/>
+              <w:bottom w:val="single" w:sz="6" w:space="0" w:color="auto"/>
+              <w:right w:val="single" w:sz="6" w:space="0" w:color="auto"/>
+            </w:tcBorders>
+            <w:tcMar>
+              <w:top w:w="240" w:type="dxa"/>
+              <w:left w:w="0" w:type="dxa"/>
+              <w:bottom w:w="240" w:type="dxa"/>
+              <w:right w:w="180" w:type="dxa"/>
+            </w:tcMar>
+            <w:vAlign w:val="center"/>
+            <w:hideMark/>
+          </w:tcPr>
+          <w:p>
+            <w:pPr>
+              <w:rPr>
+                <w:b/>
+                <w:bCs/>
+              </w:rPr>
+            </w:pPr>
+            <w:r>
+              <w:rPr>
+                <w:b/>
+                <w:bCs/>
+              </w:rPr>
+              <w:t>If the scenario says...</w:t>
+            </w:r>
+          </w:p>
+        </w:tc>
+        <w:tc>
+          <w:tcPr>
+            <w:tcW w:w="0" w:type="auto"/>
+            <w:tcBorders>
+              <w:top w:val="single" w:sz="6" w:space="0" w:color="auto"/>
+              <w:left w:val="single" w:sz="6" w:space="0" w:color="auto"/>
+              <w:bottom w:val="single" w:sz="6" w:space="0" w:color="auto"/>
+              <w:right w:val="single" w:sz="6" w:space="0" w:color="auto"/>
+            </w:tcBorders>
+            <w:tcMar>
+              <w:top w:w="240" w:type="dxa"/>
+              <w:left w:w="0" w:type="dxa"/>
+              <w:bottom w:w="240" w:type="dxa"/>
+              <w:right w:w="180" w:type="dxa"/>
+            </w:tcMar>
+            <w:vAlign w:val="center"/>
+            <w:hideMark/>
+          </w:tcPr>
+          <w:p>
+            <w:pPr>
+              <w:rPr>
+                <w:b/>
+                <w:bCs/>
+              </w:rPr>
+            </w:pPr>
+            <w:r>
+              <w:rPr>
+                <w:b/>
+                <w:bCs/>
+              </w:rPr>
+              <w:t>...It usually means</w:t>
+            </w:r>
+          </w:p>
+        </w:tc>
+        <w:tc>
+          <w:tcPr>
+            <w:tcW w:w="0" w:type="auto"/>
+            <w:tcBorders>
+              <w:top w:val="single" w:sz="6" w:space="0" w:color="auto"/>
+              <w:left w:val="single" w:sz="6" w:space="0" w:color="auto"/>
+              <w:bottom w:val="single" w:sz="6" w:space="0" w:color="auto"/>
+              <w:right w:val="single" w:sz="6" w:space="0" w:color="auto"/>
+            </w:tcBorders>
+            <w:tcMar>
+              <w:top w:w="240" w:type="dxa"/>
+              <w:left w:w="0" w:type="dxa"/>
+              <w:bottom w:w="240" w:type="dxa"/>
+              <w:right w:w="0" w:type="dxa"/>
+            </w:tcMar>
+            <w:vAlign w:val="center"/>
+            <w:hideMark/>
+          </w:tcPr>
+          <w:p>
+            <w:pPr>
+              <w:rPr>
+                <w:b/>
+                <w:bCs/>
+              </w:rPr>
+            </w:pPr>
+            <w:r>
+              <w:rPr>
+                <w:b/>
+                <w:bCs/>
+              </w:rPr>
+              <w:t>Pattern to Use</w:t>
+            </w:r>
+          </w:p>
+        </w:tc>
+      </w:tr>
+      <w:tr>
+        <w:trPr>
+          <w:tblCellSpacing w:w="15" w:type="dxa"/>
+        </w:trPr>
+        <w:tc>
+          <w:tcPr>
+            <w:tcW w:w="0" w:type="auto"/>
+            <w:tcBorders>
+              <w:top w:val="single" w:sz="6" w:space="0" w:color="auto"/>
+              <w:left w:val="single" w:sz="6" w:space="0" w:color="auto"/>
+              <w:bottom w:val="single" w:sz="6" w:space="0" w:color="auto"/>
+              <w:right w:val="single" w:sz="6" w:space="0" w:color="auto"/>
+            </w:tcBorders>
+            <w:tcMar>
+              <w:top w:w="240" w:type="dxa"/>
+              <w:left w:w="0" w:type="dxa"/>
+              <w:bottom w:w="240" w:type="dxa"/>
+              <w:right w:w="180" w:type="dxa"/>
+            </w:tcMar>
+            <w:vAlign w:val="center"/>
+            <w:hideMark/>
+          </w:tcPr>
+          <w:p>
+            <w:r>
+              <w:t>"Continuous subsegment," "Shortest window," "Subarray sum"</w:t>
+            </w:r>
+          </w:p>
+        </w:tc>
+        <w:tc>
+          <w:tcPr>
+            <w:tcW w:w="0" w:type="auto"/>
+            <w:tcBorders>
+              <w:top w:val="single" w:sz="6" w:space="0" w:color="auto"/>
+              <w:left w:val="single" w:sz="6" w:space="0" w:color="auto"/>
+              <w:bottom w:val="single" w:sz="6" w:space="0" w:color="auto"/>
+              <w:right w:val="single" w:sz="6" w:space="0" w:color="auto"/>
+            </w:tcBorders>
+            <w:tcMar>
+              <w:top w:w="240" w:type="dxa"/>
+              <w:left w:w="0" w:type="dxa"/>
+              <w:bottom w:w="240" w:type="dxa"/>
+              <w:right w:w="180" w:type="dxa"/>
+            </w:tcMar>
+            <w:vAlign w:val="center"/>
+            <w:hideMark/>
+          </w:tcPr>
+          <w:p>
+            <w:r>
+              <w:rPr>
+                <w:b/>
+                <w:bCs/>
+              </w:rPr>
+              <w:t>Subarray / String Window</w:t>
+            </w:r>
+          </w:p>
+        </w:tc>
+        <w:tc>
+          <w:tcPr>
+            <w:tcW w:w="0" w:type="auto"/>
+            <w:tcBorders>
+              <w:top w:val="single" w:sz="6" w:space="0" w:color="auto"/>
+              <w:left w:val="single" w:sz="6" w:space="0" w:color="auto"/>
+              <w:bottom w:val="single" w:sz="6" w:space="0" w:color="auto"/>
+              <w:right w:val="single" w:sz="6" w:space="0" w:color="auto"/>
+            </w:tcBorders>
+            <w:tcMar>
+              <w:top w:w="240" w:type="dxa"/>
+              <w:left w:w="0" w:type="dxa"/>
+              <w:bottom w:w="240" w:type="dxa"/>
+              <w:right w:w="0" w:type="dxa"/>
+            </w:tcMar>
+            <w:vAlign w:val="center"/>
+            <w:hideMark/>
+          </w:tcPr>
+          <w:p>
+            <w:r>
+              <w:rPr>
+                <w:rFonts w:ascii="Segoe UI Emoji" w:hAnsi="Segoe UI Emoji" w:cs="Segoe UI Emoji"/>
+              </w:rPr>
+              <w:t>⭐</w:t>
+            </w:r>
+            <w:r>
+              <w:t xml:space="preserve"> ① </w:t>
+            </w:r>
+            <w:r>
+              <w:rPr>
+                <w:b/>
+                <w:bCs/>
+              </w:rPr>
+              <w:t>Sliding Window</w:t>
+            </w:r>
+          </w:p>
+        </w:tc>
+      </w:tr>
+      <w:tr>
+        <w:trPr>
+          <w:tblCellSpacing w:w="15" w:type="dxa"/>
+        </w:trPr>
+        <w:tc>
+          <w:tcPr>
+            <w:tcW w:w="0" w:type="auto"/>
+            <w:tcBorders>
+              <w:top w:val="single" w:sz="6" w:space="0" w:color="auto"/>
+              <w:left w:val="single" w:sz="6" w:space="0" w:color="auto"/>
+              <w:bottom w:val="single" w:sz="6" w:space="0" w:color="auto"/>
+              <w:right w:val="single" w:sz="6" w:space="0" w:color="auto"/>
+            </w:tcBorders>
+            <w:tcMar>
+              <w:top w:w="240" w:type="dxa"/>
+              <w:left w:w="0" w:type="dxa"/>
+              <w:bottom w:w="240" w:type="dxa"/>
+              <w:right w:w="180" w:type="dxa"/>
+            </w:tcMar>
+            <w:vAlign w:val="center"/>
+            <w:hideMark/>
+          </w:tcPr>
+          <w:p>
+            <w:r>
+              <w:t>"Pairs that sum to X," "Sorted array," "In-place swap"</w:t>
+            </w:r>
+          </w:p>
+        </w:tc>
+        <w:tc>
+          <w:tcPr>
+            <w:tcW w:w="0" w:type="auto"/>
+            <w:tcBorders>
+              <w:top w:val="single" w:sz="6" w:space="0" w:color="auto"/>
+              <w:left w:val="single" w:sz="6" w:space="0" w:color="auto"/>
+              <w:bottom w:val="single" w:sz="6" w:space="0" w:color="auto"/>
+              <w:right w:val="single" w:sz="6" w:space="0" w:color="auto"/>
+            </w:tcBorders>
+            <w:tcMar>
+              <w:top w:w="240" w:type="dxa"/>
+              <w:left w:w="0" w:type="dxa"/>
+              <w:bottom w:w="240" w:type="dxa"/>
+              <w:right w:w="180" w:type="dxa"/>
+            </w:tcMar>
+            <w:vAlign w:val="center"/>
+            <w:hideMark/>
+          </w:tcPr>
+          <w:p>
+            <w:r>
+              <w:rPr>
+                <w:b/>
+                <w:bCs/>
+              </w:rPr>
+              <w:t>Linear Search (Optimized)</w:t>
+            </w:r>
+          </w:p>
+        </w:tc>
+        <w:tc>
+          <w:tcPr>
+            <w:tcW w:w="0" w:type="auto"/>
+            <w:tcBorders>
+              <w:top w:val="single" w:sz="6" w:space="0" w:color="auto"/>
+              <w:left w:val="single" w:sz="6" w:space="0" w:color="auto"/>
+              <w:bottom w:val="single" w:sz="6" w:space="0" w:color="auto"/>
+              <w:right w:val="single" w:sz="6" w:space="0" w:color="auto"/>
+            </w:tcBorders>
+            <w:tcMar>
+              <w:top w:w="240" w:type="dxa"/>
+              <w:left w:w="0" w:type="dxa"/>
+              <w:bottom w:w="240" w:type="dxa"/>
+              <w:right w:w="0" w:type="dxa"/>
+            </w:tcMar>
+            <w:vAlign w:val="center"/>
+            <w:hideMark/>
+          </w:tcPr>
+          <w:p>
+            <w:r>
+              <w:rPr>
+                <w:rFonts w:ascii="Segoe UI Emoji" w:hAnsi="Segoe UI Emoji" w:cs="Segoe UI Emoji"/>
+              </w:rPr>
+              <w:t>⭐</w:t>
+            </w:r>
+            <w:r>
+              <w:t xml:space="preserve"> ② </w:t>
+            </w:r>
+            <w:r>
+              <w:rPr>
+                <w:b/>
+                <w:bCs/>
+              </w:rPr>
+              <w:t>Two Pointers</w:t>
+            </w:r>
+          </w:p>
+        </w:tc>
+      </w:tr>
+      <w:tr>
+        <w:trPr>
+          <w:tblCellSpacing w:w="15" w:type="dxa"/>
+        </w:trPr>
+        <w:tc>
+          <w:tcPr>
+            <w:tcW w:w="0" w:type="auto"/>
+            <w:tcBorders>
+              <w:top w:val="single" w:sz="6" w:space="0" w:color="auto"/>
+              <w:left w:val="single" w:sz="6" w:space="0" w:color="auto"/>
+              <w:bottom w:val="single" w:sz="6" w:space="0" w:color="auto"/>
+              <w:right w:val="single" w:sz="6" w:space="0" w:color="auto"/>
+            </w:tcBorders>
+            <w:tcMar>
+              <w:top w:w="240" w:type="dxa"/>
+              <w:left w:w="0" w:type="dxa"/>
+              <w:bottom w:w="240" w:type="dxa"/>
+              <w:right w:w="180" w:type="dxa"/>
+            </w:tcMar>
+            <w:vAlign w:val="center"/>
+            <w:hideMark/>
+          </w:tcPr>
+          <w:p>
+            <w:r>
+              <w:t>"Check if exists," "Frequency," "First unique," "Group by"</w:t>
+            </w:r>
+          </w:p>
+        </w:tc>
+        <w:tc>
+          <w:tcPr>
+            <w:tcW w:w="0" w:type="auto"/>
+            <w:tcBorders>
+              <w:top w:val="single" w:sz="6" w:space="0" w:color="auto"/>
+              <w:left w:val="single" w:sz="6" w:space="0" w:color="auto"/>
+              <w:bottom w:val="single" w:sz="6" w:space="0" w:color="auto"/>
+              <w:right w:val="single" w:sz="6" w:space="0" w:color="auto"/>
+            </w:tcBorders>
+            <w:tcMar>
+              <w:top w:w="240" w:type="dxa"/>
+              <w:left w:w="0" w:type="dxa"/>
+              <w:bottom w:w="240" w:type="dxa"/>
+              <w:right w:w="180" w:type="dxa"/>
+            </w:tcMar>
+            <w:vAlign w:val="center"/>
+            <w:hideMark/>
+          </w:tcPr>
+          <w:p>
+            <w:r>
+              <w:rPr>
+                <w:b/>
+                <w:bCs/>
+              </w:rPr>
+              <w:t>Fast Lookup</w:t>
+            </w:r>
+          </w:p>
+        </w:tc>
+        <w:tc>
+          <w:tcPr>
+            <w:tcW w:w="0" w:type="auto"/>
+            <w:tcBorders>
+              <w:top w:val="single" w:sz="6" w:space="0" w:color="auto"/>
+              <w:left w:val="single" w:sz="6" w:space="0" w:color="auto"/>
+              <w:bottom w:val="single" w:sz="6" w:space="0" w:color="auto"/>
+              <w:right w:val="single" w:sz="6" w:space="0" w:color="auto"/>
+            </w:tcBorders>
+            <w:tcMar>
+              <w:top w:w="240" w:type="dxa"/>
+              <w:left w:w="0" w:type="dxa"/>
+              <w:bottom w:w="240" w:type="dxa"/>
+              <w:right w:w="0" w:type="dxa"/>
+            </w:tcMar>
+            <w:vAlign w:val="center"/>
+            <w:hideMark/>
+          </w:tcPr>
+          <w:p>
+            <w:r>
+              <w:rPr>
+                <w:rFonts w:ascii="Segoe UI Emoji" w:hAnsi="Segoe UI Emoji" w:cs="Segoe UI Emoji"/>
+              </w:rPr>
+              <w:t>⭐</w:t>
+            </w:r>
+            <w:r>
+              <w:t xml:space="preserve"> ③ </w:t>
+            </w:r>
+            <w:proofErr w:type="spellStart"/>
+            <w:r>
+              <w:rPr>
+                <w:b/>
+                <w:bCs/>
+              </w:rPr>
+              <w:t>Hashmap</w:t>
+            </w:r>
+            <w:proofErr w:type="spellEnd"/>
+            <w:r>
+              <w:rPr>
+                <w:b/>
+                <w:bCs/>
+              </w:rPr>
+              <w:t xml:space="preserve"> Counting</w:t>
+            </w:r>
+          </w:p>
+        </w:tc>
+      </w:tr>
+      <w:tr>
+        <w:trPr>
+          <w:tblCellSpacing w:w="15" w:type="dxa"/>
+        </w:trPr>
+        <w:tc>
+          <w:tcPr>
+            <w:tcW w:w="0" w:type="auto"/>
+            <w:tcBorders>
+              <w:top w:val="single" w:sz="6" w:space="0" w:color="auto"/>
+              <w:left w:val="single" w:sz="6" w:space="0" w:color="auto"/>
+              <w:bottom w:val="single" w:sz="6" w:space="0" w:color="auto"/>
+              <w:right w:val="single" w:sz="6" w:space="0" w:color="auto"/>
+            </w:tcBorders>
+            <w:tcMar>
+              <w:top w:w="240" w:type="dxa"/>
+              <w:left w:w="0" w:type="dxa"/>
+              <w:bottom w:w="240" w:type="dxa"/>
+              <w:right w:w="180" w:type="dxa"/>
+            </w:tcMar>
+            <w:vAlign w:val="center"/>
+            <w:hideMark/>
+          </w:tcPr>
+          <w:p>
+            <w:r>
+              <w:lastRenderedPageBreak/>
+              <w:t>"Hierarchy," "Folders," "All possible paths," "Deepest node"</w:t>
+            </w:r>
+          </w:p>
+        </w:tc>
+        <w:tc>
+          <w:tcPr>
+            <w:tcW w:w="0" w:type="auto"/>
+            <w:tcBorders>
+              <w:top w:val="single" w:sz="6" w:space="0" w:color="auto"/>
+              <w:left w:val="single" w:sz="6" w:space="0" w:color="auto"/>
+              <w:bottom w:val="single" w:sz="6" w:space="0" w:color="auto"/>
+              <w:right w:val="single" w:sz="6" w:space="0" w:color="auto"/>
+            </w:tcBorders>
+            <w:tcMar>
+              <w:top w:w="240" w:type="dxa"/>
+              <w:left w:w="0" w:type="dxa"/>
+              <w:bottom w:w="240" w:type="dxa"/>
+              <w:right w:w="180" w:type="dxa"/>
+            </w:tcMar>
+            <w:vAlign w:val="center"/>
+            <w:hideMark/>
+          </w:tcPr>
+          <w:p>
+            <w:r>
+              <w:rPr>
+                <w:b/>
+                <w:bCs/>
+              </w:rPr>
+              <w:t>Exhaustive Search</w:t>
+            </w:r>
+          </w:p>
+        </w:tc>
+        <w:tc>
+          <w:tcPr>
+            <w:tcW w:w="0" w:type="auto"/>
+            <w:tcBorders>
+              <w:top w:val="single" w:sz="6" w:space="0" w:color="auto"/>
+              <w:left w:val="single" w:sz="6" w:space="0" w:color="auto"/>
+              <w:bottom w:val="single" w:sz="6" w:space="0" w:color="auto"/>
+              <w:right w:val="single" w:sz="6" w:space="0" w:color="auto"/>
+            </w:tcBorders>
+            <w:tcMar>
+              <w:top w:w="240" w:type="dxa"/>
+              <w:left w:w="0" w:type="dxa"/>
+              <w:bottom w:w="240" w:type="dxa"/>
+              <w:right w:w="0" w:type="dxa"/>
+            </w:tcMar>
+            <w:vAlign w:val="center"/>
+            <w:hideMark/>
+          </w:tcPr>
+          <w:p>
+            <w:r>
+              <w:rPr>
+                <w:rFonts w:ascii="Segoe UI Emoji" w:hAnsi="Segoe UI Emoji" w:cs="Segoe UI Emoji"/>
+              </w:rPr>
+              <w:t>⭐</w:t>
+            </w:r>
+            <w:r>
+              <w:t xml:space="preserve"> ④ </w:t>
+            </w:r>
+            <w:r>
+              <w:rPr>
+                <w:b/>
+                <w:bCs/>
+              </w:rPr>
+              <w:t>DFS (Tree)</w:t>
+            </w:r>
+          </w:p>
+        </w:tc>
+      </w:tr>
+      <w:tr>
+        <w:trPr>
+          <w:tblCellSpacing w:w="15" w:type="dxa"/>
+        </w:trPr>
+        <w:tc>
+          <w:tcPr>
+            <w:tcW w:w="0" w:type="auto"/>
+            <w:tcBorders>
+              <w:top w:val="single" w:sz="6" w:space="0" w:color="auto"/>
+              <w:left w:val="single" w:sz="6" w:space="0" w:color="auto"/>
+              <w:bottom w:val="single" w:sz="6" w:space="0" w:color="auto"/>
+              <w:right w:val="single" w:sz="6" w:space="0" w:color="auto"/>
+            </w:tcBorders>
+            <w:tcMar>
+              <w:top w:w="240" w:type="dxa"/>
+              <w:left w:w="0" w:type="dxa"/>
+              <w:bottom w:w="240" w:type="dxa"/>
+              <w:right w:w="180" w:type="dxa"/>
+            </w:tcMar>
+            <w:vAlign w:val="center"/>
+            <w:hideMark/>
+          </w:tcPr>
+          <w:p>
+            <w:r>
+              <w:t xml:space="preserve">"Shortest path," "Level-by-level," "Nearest </w:t>
+            </w:r>
+            <w:proofErr w:type="spellStart"/>
+            <w:r>
+              <w:t>neighbor</w:t>
+            </w:r>
+            <w:proofErr w:type="spellEnd"/>
+            <w:r>
+              <w:t>"</w:t>
+            </w:r>
+          </w:p>
+        </w:tc>
+        <w:tc>
+          <w:tcPr>
+            <w:tcW w:w="0" w:type="auto"/>
+            <w:tcBorders>
+              <w:top w:val="single" w:sz="6" w:space="0" w:color="auto"/>
+              <w:left w:val="single" w:sz="6" w:space="0" w:color="auto"/>
+              <w:bottom w:val="single" w:sz="6" w:space="0" w:color="auto"/>
+              <w:right w:val="single" w:sz="6" w:space="0" w:color="auto"/>
+            </w:tcBorders>
+            <w:tcMar>
+              <w:top w:w="240" w:type="dxa"/>
+              <w:left w:w="0" w:type="dxa"/>
+              <w:bottom w:w="240" w:type="dxa"/>
+              <w:right w:w="180" w:type="dxa"/>
+            </w:tcMar>
+            <w:vAlign w:val="center"/>
+            <w:hideMark/>
+          </w:tcPr>
+          <w:p>
+            <w:r>
+              <w:rPr>
+                <w:b/>
+                <w:bCs/>
+              </w:rPr>
+              <w:t>Layered Search</w:t>
+            </w:r>
+          </w:p>
+        </w:tc>
+        <w:tc>
+          <w:tcPr>
+            <w:tcW w:w="0" w:type="auto"/>
+            <w:tcBorders>
+              <w:top w:val="single" w:sz="6" w:space="0" w:color="auto"/>
+              <w:left w:val="single" w:sz="6" w:space="0" w:color="auto"/>
+              <w:bottom w:val="single" w:sz="6" w:space="0" w:color="auto"/>
+              <w:right w:val="single" w:sz="6" w:space="0" w:color="auto"/>
+            </w:tcBorders>
+            <w:tcMar>
+              <w:top w:w="240" w:type="dxa"/>
+              <w:left w:w="0" w:type="dxa"/>
+              <w:bottom w:w="240" w:type="dxa"/>
+              <w:right w:w="0" w:type="dxa"/>
+            </w:tcMar>
+            <w:vAlign w:val="center"/>
+            <w:hideMark/>
+          </w:tcPr>
+          <w:p>
+            <w:r>
+              <w:rPr>
+                <w:rFonts w:ascii="Segoe UI Emoji" w:hAnsi="Segoe UI Emoji" w:cs="Segoe UI Emoji"/>
+              </w:rPr>
+              <w:t>⭐</w:t>
+            </w:r>
+            <w:r>
+              <w:t xml:space="preserve"> ⑤ </w:t>
+            </w:r>
+            <w:r>
+              <w:rPr>
+                <w:b/>
+                <w:bCs/>
+              </w:rPr>
+              <w:t>BFS (Tree/Graph)</w:t>
+            </w:r>
+          </w:p>
+        </w:tc>
+      </w:tr>
+      <w:tr>
+        <w:trPr>
+          <w:tblCellSpacing w:w="15" w:type="dxa"/>
+        </w:trPr>
+        <w:tc>
+          <w:tcPr>
+            <w:tcW w:w="0" w:type="auto"/>
+            <w:tcBorders>
+              <w:top w:val="single" w:sz="6" w:space="0" w:color="auto"/>
+              <w:left w:val="single" w:sz="6" w:space="0" w:color="auto"/>
+              <w:bottom w:val="single" w:sz="6" w:space="0" w:color="auto"/>
+              <w:right w:val="single" w:sz="6" w:space="0" w:color="auto"/>
+            </w:tcBorders>
+            <w:tcMar>
+              <w:top w:w="240" w:type="dxa"/>
+              <w:left w:w="0" w:type="dxa"/>
+              <w:bottom w:w="240" w:type="dxa"/>
+              <w:right w:w="180" w:type="dxa"/>
+            </w:tcMar>
+            <w:vAlign w:val="center"/>
+            <w:hideMark/>
+          </w:tcPr>
+          <w:p>
+            <w:r>
+              <w:t>"Top X," "Best K," "Running median," "Frequent items"</w:t>
+            </w:r>
+          </w:p>
+        </w:tc>
+        <w:tc>
+          <w:tcPr>
+            <w:tcW w:w="0" w:type="auto"/>
+            <w:tcBorders>
+              <w:top w:val="single" w:sz="6" w:space="0" w:color="auto"/>
+              <w:left w:val="single" w:sz="6" w:space="0" w:color="auto"/>
+              <w:bottom w:val="single" w:sz="6" w:space="0" w:color="auto"/>
+              <w:right w:val="single" w:sz="6" w:space="0" w:color="auto"/>
+            </w:tcBorders>
+            <w:tcMar>
+              <w:top w:w="240" w:type="dxa"/>
+              <w:left w:w="0" w:type="dxa"/>
+              <w:bottom w:w="240" w:type="dxa"/>
+              <w:right w:w="180" w:type="dxa"/>
+            </w:tcMar>
+            <w:vAlign w:val="center"/>
+            <w:hideMark/>
+          </w:tcPr>
+          <w:p>
+            <w:r>
+              <w:rPr>
+                <w:b/>
+                <w:bCs/>
+              </w:rPr>
+              <w:t>Dynamic Ranking</w:t>
+            </w:r>
+          </w:p>
+        </w:tc>
+        <w:tc>
+          <w:tcPr>
+            <w:tcW w:w="0" w:type="auto"/>
+            <w:tcBorders>
+              <w:top w:val="single" w:sz="6" w:space="0" w:color="auto"/>
+              <w:left w:val="single" w:sz="6" w:space="0" w:color="auto"/>
+              <w:bottom w:val="single" w:sz="6" w:space="0" w:color="auto"/>
+              <w:right w:val="single" w:sz="6" w:space="0" w:color="auto"/>
+            </w:tcBorders>
+            <w:tcMar>
+              <w:top w:w="240" w:type="dxa"/>
+              <w:left w:w="0" w:type="dxa"/>
+              <w:bottom w:w="240" w:type="dxa"/>
+              <w:right w:w="0" w:type="dxa"/>
+            </w:tcMar>
+            <w:vAlign w:val="center"/>
+            <w:hideMark/>
+          </w:tcPr>
+          <w:p>
+            <w:r>
+              <w:rPr>
+                <w:rFonts w:ascii="Segoe UI Emoji" w:hAnsi="Segoe UI Emoji" w:cs="Segoe UI Emoji"/>
+              </w:rPr>
+              <w:t>⭐</w:t>
+            </w:r>
+            <w:r>
+              <w:t xml:space="preserve"> ⑦ </w:t>
+            </w:r>
+            <w:r>
+              <w:rPr>
+                <w:b/>
+                <w:bCs/>
+              </w:rPr>
+              <w:t>Top K (Heap)</w:t>
+            </w:r>
+          </w:p>
+        </w:tc>
+      </w:tr>
+      <w:tr>
+        <w:trPr>
+          <w:tblCellSpacing w:w="15" w:type="dxa"/>
+        </w:trPr>
+        <w:tc>
+          <w:tcPr>
+            <w:tcW w:w="0" w:type="auto"/>
+            <w:tcBorders>
+              <w:top w:val="single" w:sz="6" w:space="0" w:color="auto"/>
+              <w:left w:val="single" w:sz="6" w:space="0" w:color="auto"/>
+              <w:bottom w:val="single" w:sz="6" w:space="0" w:color="auto"/>
+              <w:right w:val="single" w:sz="6" w:space="0" w:color="auto"/>
+            </w:tcBorders>
+            <w:tcMar>
+              <w:top w:w="240" w:type="dxa"/>
+              <w:left w:w="0" w:type="dxa"/>
+              <w:bottom w:w="240" w:type="dxa"/>
+              <w:right w:w="180" w:type="dxa"/>
+            </w:tcMar>
+            <w:vAlign w:val="center"/>
+            <w:hideMark/>
+          </w:tcPr>
+          <w:p>
+            <w:r>
+              <w:t>"Dependencies," "Prerequisites," "Order of tasks"</w:t>
+            </w:r>
+          </w:p>
+        </w:tc>
+        <w:tc>
+          <w:tcPr>
+            <w:tcW w:w="0" w:type="auto"/>
+            <w:tcBorders>
+              <w:top w:val="single" w:sz="6" w:space="0" w:color="auto"/>
+              <w:left w:val="single" w:sz="6" w:space="0" w:color="auto"/>
+              <w:bottom w:val="single" w:sz="6" w:space="0" w:color="auto"/>
+              <w:right w:val="single" w:sz="6" w:space="0" w:color="auto"/>
+            </w:tcBorders>
+            <w:tcMar>
+              <w:top w:w="240" w:type="dxa"/>
+              <w:left w:w="0" w:type="dxa"/>
+              <w:bottom w:w="240" w:type="dxa"/>
+              <w:right w:w="180" w:type="dxa"/>
+            </w:tcMar>
+            <w:vAlign w:val="center"/>
+            <w:hideMark/>
+          </w:tcPr>
+          <w:p>
+            <w:r>
+              <w:rPr>
+                <w:b/>
+                <w:bCs/>
+              </w:rPr>
+              <w:t>Ordering</w:t>
+            </w:r>
+          </w:p>
+        </w:tc>
+        <w:tc>
+          <w:tcPr>
+            <w:tcW w:w="0" w:type="auto"/>
+            <w:tcBorders>
+              <w:top w:val="single" w:sz="6" w:space="0" w:color="auto"/>
+              <w:left w:val="single" w:sz="6" w:space="0" w:color="auto"/>
+              <w:bottom w:val="single" w:sz="6" w:space="0" w:color="auto"/>
+              <w:right w:val="single" w:sz="6" w:space="0" w:color="auto"/>
+            </w:tcBorders>
+            <w:tcMar>
+              <w:top w:w="240" w:type="dxa"/>
+              <w:left w:w="0" w:type="dxa"/>
+              <w:bottom w:w="240" w:type="dxa"/>
+              <w:right w:w="0" w:type="dxa"/>
+            </w:tcMar>
+            <w:vAlign w:val="center"/>
+            <w:hideMark/>
+          </w:tcPr>
+          <w:p>
+            <w:r>
+              <w:rPr>
+                <w:rFonts w:ascii="Segoe UI Emoji" w:hAnsi="Segoe UI Emoji" w:cs="Segoe UI Emoji"/>
+              </w:rPr>
+              <w:t>⭐</w:t>
+            </w:r>
+            <w:r>
+              <w:t xml:space="preserve"> ⑩ </w:t>
+            </w:r>
+            <w:r>
+              <w:rPr>
+                <w:b/>
+                <w:bCs/>
+              </w:rPr>
+              <w:t>Topological Sort</w:t>
+            </w:r>
+          </w:p>
+        </w:tc>
+      </w:tr>
+      <w:tr>
+        <w:trPr>
+          <w:tblCellSpacing w:w="15" w:type="dxa"/>
+        </w:trPr>
+        <w:tc>
+          <w:tcPr>
+            <w:tcW w:w="0" w:type="auto"/>
+            <w:tcBorders>
+              <w:top w:val="single" w:sz="6" w:space="0" w:color="auto"/>
+              <w:left w:val="single" w:sz="6" w:space="0" w:color="auto"/>
+              <w:bottom w:val="single" w:sz="6" w:space="0" w:color="auto"/>
+              <w:right w:val="single" w:sz="6" w:space="0" w:color="auto"/>
+            </w:tcBorders>
+            <w:tcMar>
+              <w:top w:w="240" w:type="dxa"/>
+              <w:left w:w="0" w:type="dxa"/>
+              <w:bottom w:w="240" w:type="dxa"/>
+              <w:right w:w="180" w:type="dxa"/>
+            </w:tcMar>
+            <w:vAlign w:val="center"/>
+            <w:hideMark/>
+          </w:tcPr>
+          <w:p>
+            <w:r>
+              <w:t>"Network connectivity," "Islands," "Groups of friends"</w:t>
+            </w:r>
+          </w:p>
+        </w:tc>
+        <w:tc>
+          <w:tcPr>
+            <w:tcW w:w="0" w:type="auto"/>
+            <w:tcBorders>
+              <w:top w:val="single" w:sz="6" w:space="0" w:color="auto"/>
+              <w:left w:val="single" w:sz="6" w:space="0" w:color="auto"/>
+              <w:bottom w:val="single" w:sz="6" w:space="0" w:color="auto"/>
+              <w:right w:val="single" w:sz="6" w:space="0" w:color="auto"/>
+            </w:tcBorders>
+            <w:tcMar>
+              <w:top w:w="240" w:type="dxa"/>
+              <w:left w:w="0" w:type="dxa"/>
+              <w:bottom w:w="240" w:type="dxa"/>
+              <w:right w:w="180" w:type="dxa"/>
+            </w:tcMar>
+            <w:vAlign w:val="center"/>
+            <w:hideMark/>
+          </w:tcPr>
+          <w:p>
+            <w:r>
+              <w:rPr>
+                <w:b/>
+                <w:bCs/>
+              </w:rPr>
+              <w:t>Connectivity</w:t>
+            </w:r>
+          </w:p>
+        </w:tc>
+        <w:tc>
+          <w:tcPr>
+            <w:tcW w:w="0" w:type="auto"/>
+            <w:tcBorders>
+              <w:top w:val="single" w:sz="6" w:space="0" w:color="auto"/>
+              <w:left w:val="single" w:sz="6" w:space="0" w:color="auto"/>
+              <w:bottom w:val="single" w:sz="6" w:space="0" w:color="auto"/>
+              <w:right w:val="single" w:sz="6" w:space="0" w:color="auto"/>
+            </w:tcBorders>
+            <w:tcMar>
+              <w:top w:w="240" w:type="dxa"/>
+              <w:left w:w="0" w:type="dxa"/>
+              <w:bottom w:w="240" w:type="dxa"/>
+              <w:right w:w="0" w:type="dxa"/>
+            </w:tcMar>
+            <w:vAlign w:val="center"/>
+            <w:hideMark/>
+          </w:tcPr>
+          <w:p>
+            <w:r>
+              <w:rPr>
+                <w:rFonts w:ascii="Segoe UI Emoji" w:hAnsi="Segoe UI Emoji" w:cs="Segoe UI Emoji"/>
+              </w:rPr>
+              <w:t>⭐</w:t>
+            </w:r>
+            <w:r>
+              <w:t xml:space="preserve"> ⑪ </w:t>
+            </w:r>
+            <w:r>
+              <w:rPr>
+                <w:b/>
+                <w:bCs/>
+              </w:rPr>
+              <w:t>Union-Find</w:t>
+            </w:r>
+          </w:p>
+        </w:tc>
+      </w:tr>
+      <w:tr>
+        <w:trPr>
+          <w:tblCellSpacing w:w="15" w:type="dxa"/>
+        </w:trPr>
+        <w:tc>
+          <w:tcPr>
+            <w:tcW w:w="0" w:type="auto"/>
+            <w:tcBorders>
+              <w:top w:val="single" w:sz="6" w:space="0" w:color="auto"/>
+              <w:left w:val="single" w:sz="6" w:space="0" w:color="auto"/>
+              <w:bottom w:val="single" w:sz="6" w:space="0" w:color="auto"/>
+              <w:right w:val="single" w:sz="6" w:space="0" w:color="auto"/>
+            </w:tcBorders>
+            <w:tcMar>
+              <w:top w:w="240" w:type="dxa"/>
+              <w:left w:w="0" w:type="dxa"/>
+              <w:bottom w:w="240" w:type="dxa"/>
+              <w:right w:w="180" w:type="dxa"/>
+            </w:tcMar>
+            <w:vAlign w:val="center"/>
+            <w:hideMark/>
+          </w:tcPr>
+          <w:p>
+            <w:r>
+              <w:t>"Meetings," "Overlapping times," "Schedule"</w:t>
+            </w:r>
+          </w:p>
+        </w:tc>
+        <w:tc>
+          <w:tcPr>
+            <w:tcW w:w="0" w:type="auto"/>
+            <w:tcBorders>
+              <w:top w:val="single" w:sz="6" w:space="0" w:color="auto"/>
+              <w:left w:val="single" w:sz="6" w:space="0" w:color="auto"/>
+              <w:bottom w:val="single" w:sz="6" w:space="0" w:color="auto"/>
+              <w:right w:val="single" w:sz="6" w:space="0" w:color="auto"/>
+            </w:tcBorders>
+            <w:tcMar>
+              <w:top w:w="240" w:type="dxa"/>
+              <w:left w:w="0" w:type="dxa"/>
+              <w:bottom w:w="240" w:type="dxa"/>
+              <w:right w:w="180" w:type="dxa"/>
+            </w:tcMar>
+            <w:vAlign w:val="center"/>
+            <w:hideMark/>
+          </w:tcPr>
+          <w:p>
+            <w:r>
+              <w:rPr>
+                <w:b/>
+                <w:bCs/>
+              </w:rPr>
+              <w:t>Time Intervals</w:t>
+            </w:r>
+          </w:p>
+        </w:tc>
+        <w:tc>
+          <w:tcPr>
+            <w:tcW w:w="0" w:type="auto"/>
+            <w:tcBorders>
+              <w:top w:val="single" w:sz="6" w:space="0" w:color="auto"/>
+              <w:left w:val="single" w:sz="6" w:space="0" w:color="auto"/>
+              <w:bottom w:val="single" w:sz="6" w:space="0" w:color="auto"/>
+              <w:right w:val="single" w:sz="6" w:space="0" w:color="auto"/>
+            </w:tcBorders>
+            <w:tcMar>
+              <w:top w:w="240" w:type="dxa"/>
+              <w:left w:w="0" w:type="dxa"/>
+              <w:bottom w:w="240" w:type="dxa"/>
+              <w:right w:w="0" w:type="dxa"/>
+            </w:tcMar>
+            <w:vAlign w:val="center"/>
+            <w:hideMark/>
+          </w:tcPr>
+          <w:p>
+            <w:r>
+              <w:rPr>
+                <w:rFonts w:ascii="Segoe UI Emoji" w:hAnsi="Segoe UI Emoji" w:cs="Segoe UI Emoji"/>
+              </w:rPr>
+              <w:t>⭐</w:t>
+            </w:r>
+            <w:r>
+              <w:t xml:space="preserve"> ⑫ </w:t>
+            </w:r>
+            <w:r>
+              <w:rPr>
+                <w:b/>
+                <w:bCs/>
+              </w:rPr>
+              <w:t>Merge Intervals</w:t>
+            </w:r>
+          </w:p>
+        </w:tc>
+      </w:tr>
+      <w:tr>
+        <w:trPr>
+          <w:tblCellSpacing w:w="15" w:type="dxa"/>
+        </w:trPr>
+        <w:tc>
+          <w:tcPr>
+            <w:tcW w:w="0" w:type="auto"/>
+            <w:tcBorders>
+              <w:top w:val="single" w:sz="6" w:space="0" w:color="auto"/>
+              <w:left w:val="single" w:sz="6" w:space="0" w:color="auto"/>
+              <w:bottom w:val="single" w:sz="6" w:space="0" w:color="auto"/>
+              <w:right w:val="single" w:sz="6" w:space="0" w:color="auto"/>
+            </w:tcBorders>
+            <w:tcMar>
+              <w:top w:w="240" w:type="dxa"/>
+              <w:left w:w="0" w:type="dxa"/>
+              <w:bottom w:w="240" w:type="dxa"/>
+              <w:right w:w="180" w:type="dxa"/>
+            </w:tcMar>
+            <w:vAlign w:val="center"/>
+            <w:hideMark/>
+          </w:tcPr>
+          <w:p>
+            <w:r>
+              <w:t>"Next greater," "Stock span," "Valid brackets"</w:t>
+            </w:r>
+          </w:p>
+        </w:tc>
+        <w:tc>
+          <w:tcPr>
+            <w:tcW w:w="0" w:type="auto"/>
+            <w:tcBorders>
+              <w:top w:val="single" w:sz="6" w:space="0" w:color="auto"/>
+              <w:left w:val="single" w:sz="6" w:space="0" w:color="auto"/>
+              <w:bottom w:val="single" w:sz="6" w:space="0" w:color="auto"/>
+              <w:right w:val="single" w:sz="6" w:space="0" w:color="auto"/>
+            </w:tcBorders>
+            <w:tcMar>
+              <w:top w:w="240" w:type="dxa"/>
+              <w:left w:w="0" w:type="dxa"/>
+              <w:bottom w:w="240" w:type="dxa"/>
+              <w:right w:w="180" w:type="dxa"/>
+            </w:tcMar>
+            <w:vAlign w:val="center"/>
+            <w:hideMark/>
+          </w:tcPr>
+          <w:p>
+            <w:r>
+              <w:rPr>
+                <w:b/>
+                <w:bCs/>
+              </w:rPr>
+              <w:t>Linear History</w:t>
+            </w:r>
+          </w:p>
+        </w:tc>
+        <w:tc>
+          <w:tcPr>
+            <w:tcW w:w="0" w:type="auto"/>
+            <w:tcBorders>
+              <w:top w:val="single" w:sz="6" w:space="0" w:color="auto"/>
+              <w:left w:val="single" w:sz="6" w:space="0" w:color="auto"/>
+              <w:bottom w:val="single" w:sz="6" w:space="0" w:color="auto"/>
+              <w:right w:val="single" w:sz="6" w:space="0" w:color="auto"/>
+            </w:tcBorders>
+            <w:tcMar>
+              <w:top w:w="240" w:type="dxa"/>
+              <w:left w:w="0" w:type="dxa"/>
+              <w:bottom w:w="240" w:type="dxa"/>
+              <w:right w:w="0" w:type="dxa"/>
+            </w:tcMar>
+            <w:vAlign w:val="center"/>
+            <w:hideMark/>
+          </w:tcPr>
+          <w:p>
+            <w:r>
+              <w:rPr>
+                <w:rFonts w:ascii="Segoe UI Emoji" w:hAnsi="Segoe UI Emoji" w:cs="Segoe UI Emoji"/>
+              </w:rPr>
+              <w:t>⭐</w:t>
+            </w:r>
+            <w:r>
+              <w:t xml:space="preserve"> ⑮ </w:t>
+            </w:r>
+            <w:r>
+              <w:rPr>
+                <w:b/>
+                <w:bCs/>
+              </w:rPr>
+              <w:t>Monotonic Stack</w:t>
+            </w:r>
+          </w:p>
+        </w:tc>
+      </w:tr>
+      <w:tr>
+        <w:trPr>
+          <w:tblCellSpacing w:w="15" w:type="dxa"/>
+        </w:trPr>
+        <w:tc>
+          <w:tcPr>
+            <w:tcW w:w="0" w:type="auto"/>
+            <w:tcBorders>
+              <w:top w:val="single" w:sz="6" w:space="0" w:color="auto"/>
+              <w:left w:val="single" w:sz="6" w:space="0" w:color="auto"/>
+              <w:bottom w:val="single" w:sz="6" w:space="0" w:color="auto"/>
+              <w:right w:val="single" w:sz="6" w:space="0" w:color="auto"/>
+            </w:tcBorders>
+            <w:tcMar>
+              <w:top w:w="240" w:type="dxa"/>
+              <w:left w:w="0" w:type="dxa"/>
+              <w:bottom w:w="240" w:type="dxa"/>
+              <w:right w:w="180" w:type="dxa"/>
+            </w:tcMar>
+            <w:vAlign w:val="center"/>
+            <w:hideMark/>
+          </w:tcPr>
+          <w:p>
+            <w:r>
+              <w:t>"Max/Min profit," "Ways to reach," "Optimization"</w:t>
+            </w:r>
+          </w:p>
+        </w:tc>
+        <w:tc>
+          <w:tcPr>
+            <w:tcW w:w="0" w:type="auto"/>
+            <w:tcBorders>
+              <w:top w:val="single" w:sz="6" w:space="0" w:color="auto"/>
+              <w:left w:val="single" w:sz="6" w:space="0" w:color="auto"/>
+              <w:bottom w:val="single" w:sz="6" w:space="0" w:color="auto"/>
+              <w:right w:val="single" w:sz="6" w:space="0" w:color="auto"/>
+            </w:tcBorders>
+            <w:tcMar>
+              <w:top w:w="240" w:type="dxa"/>
+              <w:left w:w="0" w:type="dxa"/>
+              <w:bottom w:w="240" w:type="dxa"/>
+              <w:right w:w="180" w:type="dxa"/>
+            </w:tcMar>
+            <w:vAlign w:val="center"/>
+            <w:hideMark/>
+          </w:tcPr>
+          <w:p>
+            <w:r>
+              <w:rPr>
+                <w:b/>
+                <w:bCs/>
+              </w:rPr>
+              <w:t>Recursive Decisions</w:t>
+            </w:r>
+          </w:p>
+        </w:tc>
+        <w:tc>
+          <w:tcPr>
+            <w:tcW w:w="0" w:type="auto"/>
+            <w:tcBorders>
+              <w:top w:val="single" w:sz="6" w:space="0" w:color="auto"/>
+              <w:left w:val="single" w:sz="6" w:space="0" w:color="auto"/>
+              <w:bottom w:val="single" w:sz="6" w:space="0" w:color="auto"/>
+              <w:right w:val="single" w:sz="6" w:space="0" w:color="auto"/>
+            </w:tcBorders>
+            <w:tcMar>
+              <w:top w:w="240" w:type="dxa"/>
+              <w:left w:w="0" w:type="dxa"/>
+              <w:bottom w:w="240" w:type="dxa"/>
+              <w:right w:w="0" w:type="dxa"/>
+            </w:tcMar>
+            <w:vAlign w:val="center"/>
+            <w:hideMark/>
+          </w:tcPr>
+          <w:p>
+            <w:r>
+              <w:rPr>
+                <w:rFonts w:ascii="Segoe UI Emoji" w:hAnsi="Segoe UI Emoji" w:cs="Segoe UI Emoji"/>
+              </w:rPr>
+              <w:t>⭐</w:t>
+            </w:r>
+            <w:r>
+              <w:t xml:space="preserve"> ⑰ </w:t>
+            </w:r>
+            <w:r>
+              <w:rPr>
+                <w:b/>
+                <w:bCs/>
+              </w:rPr>
+              <w:t>Dynamic Programming</w:t>
+            </w:r>
+          </w:p>
+        </w:tc>
+      </w:tr>
+    </w:tbl>
     <w:p/>
     <w:sectPr>
       <w:pgSz w:w="11906" w:h="16838"/>
@@ -30140,7 +31317,6 @@
   <w:style w:type="character" w:default="1" w:styleId="DefaultParagraphFont">
     <w:name w:val="Default Paragraph Font"/>
     <w:uiPriority w:val="1"/>
-    <w:semiHidden/>
     <w:unhideWhenUsed/>
   </w:style>
   <w:style w:type="table" w:default="1" w:styleId="TableNormal">

</xml_diff>